<commit_message>
Sync downloadable resume documents
</commit_message>
<xml_diff>
--- a/downloads/Daisy_Wangondu_CV (1).docx
+++ b/downloads/Daisy_Wangondu_CV (1).docx
@@ -242,12 +242,47 @@
           <w:rPr>
             <w:b/>
           </w:rPr>
-          <w:t xml:space="preserve">Founder | Content Strategist | Social Media Manager     2024 ? Present</w:t>
+          <w:t xml:space="preserve">THE BOTANISOUL | Founder &amp; Brand Strategist     2024 ? Present</w:t>
         </w:r>
       </w:p>
       <w:p>
         <w:r>
-          <w:t xml:space="preserve">The BotaniSoul  |  Plant-powered wellness brand</w:t>
+          <w:t xml:space="preserve">Plant-powered wellness and lifestyle brand</w:t>
+        </w:r>
+      </w:p>
+      <w:p>
+        <w:r>
+          <w:t xml:space="preserve">Founded and developed The BotaniSoul, a plant-powered wellness and lifestyle brand focused on natural self-care, botanical products, plants and conscious living. Lead the brand's creative direction, product development, digital presence and customer experience.</w:t>
+        </w:r>
+      </w:p>
+      <w:p>
+        <w:r>
+          <w:t xml:space="preserve">Developed and positioned a distinctive brand identity within the natural wellness and botanical lifestyle space.</w:t>
+        </w:r>
+      </w:p>
+      <w:p>
+        <w:r>
+          <w:t xml:space="preserve">Created and developed plant-based wellness and personal care products, including herbal hair oils and botanical self-care solutions.</w:t>
+        </w:r>
+      </w:p>
+      <w:p>
+        <w:r>
+          <w:t xml:space="preserve">Produced engaging visual content, product photography, videos and educational content to build brand awareness and community.</w:t>
+        </w:r>
+      </w:p>
+      <w:p>
+        <w:r>
+          <w:t xml:space="preserve">Managed product development, packaging concepts, customer engagement and brand storytelling.</w:t>
+        </w:r>
+      </w:p>
+      <w:p>
+        <w:r>
+          <w:t xml:space="preserve">Built experience in entrepreneurship, digital marketing, e-commerce, creative strategy and community building.</w:t>
+        </w:r>
+      </w:p>
+      <w:p>
+        <w:r>
+          <w:t xml:space="preserve">Participated in markets and physical selling opportunities to introduce products directly to customers and gather consumer insights.</w:t>
         </w:r>
       </w:p>
       <w:p>

</xml_diff>